<commit_message>
docs: finalizar documentacion con integrantes y evidencias
</commit_message>
<xml_diff>
--- a/documentacion/ERS_Gas_El_Volcan_Revision_2_1_React.docx
+++ b/documentacion/ERS_Gas_El_Volcan_Revision_2_1_React.docx
@@ -3502,7 +3502,7 @@
                 <w:i/>
                 <w:szCs w:val="24"/>
               </w:rPr>
-              <w:t>Leonardo Bastidas, Gerald Zambrano</w:t>
+              <w:t>Leonardo Bastidas, Gerard Zambrano</w:t>
             </w:r>
           </w:p>
         </w:tc>
@@ -3560,7 +3560,7 @@
           </w:tcPr>
           <w:p>
             <w:r>
-              <w:t>Leonardo Bastidas, Gerald Zambrano</w:t>
+              <w:t>Leonardo Bastidas, Gerard Zambrano</w:t>
             </w:r>
           </w:p>
         </w:tc>
@@ -3603,7 +3603,7 @@
           </w:tcPr>
           <w:p>
             <w:r>
-              <w:t>Equipo Gas El Volcán</w:t>
+              <w:t>Gerard Zambrano y Leonardo Bastidas</w:t>
             </w:r>
           </w:p>
         </w:tc>
@@ -4251,7 +4251,7 @@
                 <w:szCs w:val="24"/>
                 <w:lang w:eastAsia="es-ES"/>
               </w:rPr>
-              <w:t xml:space="preserve"> Gerald Zambrano</w:t>
+              <w:t xml:space="preserve"> Gerard Zambrano</w:t>
             </w:r>
           </w:p>
         </w:tc>

</xml_diff>